<commit_message>
Deploy preview for PR 4 🛫
</commit_message>
<xml_diff>
--- a/pr-preview/pr-4/vignettes/quarto_vignette.docx
+++ b/pr-preview/pr-4/vignettes/quarto_vignette.docx
@@ -1437,17 +1437,26 @@
         </w:numPr>
       </w:pPr>
       <w:r>
-        <w:t xml:space="preserve">UCD-SERG (2024)</w:t>
+        <w:t xml:space="preserve">pr.helpers authors</w:t>
+      </w:r>
+      <w:r>
+        <w:t xml:space="preserve"> </w:t>
+      </w:r>
+      <w:r>
+        <w:t xml:space="preserve">(2024)</w:t>
       </w:r>
     </w:p>
     <w:bookmarkStart w:id="35" w:name="refs"/>
-    <w:bookmarkStart w:id="32" w:name="ref-R-base"/>
+    <w:bookmarkStart w:id="32" w:name="ref-R-pr.helpers"/>
     <w:p>
       <w:pPr>
         <w:pStyle w:val="Bibliography"/>
       </w:pPr>
       <w:r>
-        <w:t xml:space="preserve">R Core Team. 2024.</w:t>
+        <w:t xml:space="preserve">pr.helpers authors</w:t>
+      </w:r>
+      <w:r>
+        <w:t xml:space="preserve">. 2024.</w:t>
       </w:r>
       <w:r>
         <w:t xml:space="preserve"> </w:t>
@@ -1457,10 +1466,10 @@
           <w:i/>
           <w:iCs/>
         </w:rPr>
-        <w:t xml:space="preserve">R: A Language and Environment for Statistical Computing</w:t>
-      </w:r>
-      <w:r>
-        <w:t xml:space="preserve">. R Foundation for Statistical Computing.</w:t>
+        <w:t xml:space="preserve">Pr.helpers: R Package Template</w:t>
+      </w:r>
+      <w:r>
+        <w:t xml:space="preserve">.</w:t>
       </w:r>
       <w:r>
         <w:t xml:space="preserve"> </w:t>
@@ -1470,7 +1479,7 @@
           <w:rPr>
             <w:rStyle w:val="Hyperlink"/>
           </w:rPr>
-          <w:t xml:space="preserve">https://www.R-project.org/</w:t>
+          <w:t xml:space="preserve">https://github.com/d-morrison/pr.helpers</w:t>
         </w:r>
       </w:hyperlink>
       <w:r>
@@ -1478,13 +1487,13 @@
       </w:r>
     </w:p>
     <w:bookmarkEnd w:id="32"/>
-    <w:bookmarkStart w:id="34" w:name="ref-R-pr.helpers"/>
+    <w:bookmarkStart w:id="34" w:name="ref-R-base"/>
     <w:p>
       <w:pPr>
         <w:pStyle w:val="Bibliography"/>
       </w:pPr>
       <w:r>
-        <w:t xml:space="preserve">UCD-SERG. 2024.</w:t>
+        <w:t xml:space="preserve">R Core Team. 2024.</w:t>
       </w:r>
       <w:r>
         <w:t xml:space="preserve"> </w:t>
@@ -1494,10 +1503,10 @@
           <w:i/>
           <w:iCs/>
         </w:rPr>
-        <w:t xml:space="preserve">Pr.helpers: R Package Template</w:t>
-      </w:r>
-      <w:r>
-        <w:t xml:space="preserve">.</w:t>
+        <w:t xml:space="preserve">R: A Language and Environment for Statistical Computing</w:t>
+      </w:r>
+      <w:r>
+        <w:t xml:space="preserve">. R Foundation for Statistical Computing.</w:t>
       </w:r>
       <w:r>
         <w:t xml:space="preserve"> </w:t>
@@ -1507,7 +1516,7 @@
           <w:rPr>
             <w:rStyle w:val="Hyperlink"/>
           </w:rPr>
-          <w:t xml:space="preserve">https://github.com/UCD-SERG/pr.helpers</w:t>
+          <w:t xml:space="preserve">https://www.R-project.org/</w:t>
         </w:r>
       </w:hyperlink>
       <w:r>

</xml_diff>